<commit_message>
Trim commodity math in methodology, strengthen results analysis
- Condense section 3 (attention/AdamW math) since it's standard across teams
- Add SST per-label F1 table to support the neutral-bottleneck finding

Co-Authored-By: Claude Sonnet 4.6 <noreply@anthropic.com>
</commit_message>
<xml_diff>
--- a/reports/PART1_report.docx
+++ b/reports/PART1_report.docx
@@ -2,7 +2,7 @@
 <file path=word/document.xml><?xml version="1.0" encoding="utf-8"?>
 <w:document xmlns:w="http://schemas.openxmlformats.org/wordprocessingml/2006/main" xmlns:m="http://schemas.openxmlformats.org/officeDocument/2006/math" xmlns:r="http://schemas.openxmlformats.org/officeDocument/2006/relationships" xmlns:o="urn:schemas-microsoft-com:office:office" xmlns:v="urn:schemas-microsoft-com:vml" xmlns:w10="urn:schemas-microsoft-com:office:word" xmlns:a="http://schemas.openxmlformats.org/drawingml/2006/main" xmlns:pic="http://schemas.openxmlformats.org/drawingml/2006/picture" xmlns:wp="http://schemas.openxmlformats.org/drawingml/2006/wordprocessingDrawing">
   <w:body>
-    <w:bookmarkStart w:id="30" w:name="Xe83c11b301f765f922346098ddeb5764defca67"/>
+    <w:bookmarkStart w:id="29" w:name="Xe83c11b301f765f922346098ddeb5764defca67"/>
     <w:p>
       <w:pPr>
         <w:pStyle w:val="Heading1"/>
@@ -632,7 +632,7 @@
       </w:r>
     </w:p>
     <w:bookmarkEnd w:id="15"/>
-    <w:bookmarkStart w:id="22" w:name="제안-방법론-proposed-approach"/>
+    <w:bookmarkStart w:id="21" w:name="제안-방법론-proposed-approach"/>
     <w:p>
       <w:pPr>
         <w:pStyle w:val="Heading2"/>
@@ -821,13 +821,21 @@
         <w:t xml:space="preserve">)는 과제에서 제공된 것을 그대로 사용하였다.</w:t>
       </w:r>
     </w:p>
-    <w:bookmarkStart w:id="16" w:name="causal-self-attention"/>
+    <w:p>
+      <w:pPr>
+        <w:pStyle w:val="BlockText"/>
+      </w:pPr>
+      <w:r>
+        <w:t xml:space="preserve">GPT-2 아키텍처와 AdamW는 표준 정의를 따르므로 본 절에서는 핵심만 간략히 기술하고, 본 연구의 분석적 기여는 4장(실험)에 집중한다.</w:t>
+      </w:r>
+    </w:p>
+    <w:bookmarkStart w:id="16" w:name="gpt-2-아키텍처"/>
     <w:p>
       <w:pPr>
         <w:pStyle w:val="Heading3"/>
       </w:pPr>
       <w:r>
-        <w:t xml:space="preserve">3.1 Causal Self-Attention</w:t>
+        <w:t xml:space="preserve">3.1 GPT-2 아키텍처</w:t>
       </w:r>
     </w:p>
     <w:p>
@@ -835,104 +843,53 @@
         <w:pStyle w:val="FirstParagraph"/>
       </w:pPr>
       <w:r>
-        <w:t xml:space="preserve">입력 은닉 상태</w:t>
+        <w:t xml:space="preserve">GPT-2는 디코더-only Transformer로, 각 블록이 Causal Self-Attention과 Feed-Forward로 구성되며 두 서브레이어</w:t>
+      </w:r>
+      <w:r>
+        <w:t xml:space="preserve"> </w:t>
+      </w:r>
+      <w:r>
+        <w:rPr>
+          <w:b/>
+          <w:bCs/>
+        </w:rPr>
+        <w:t xml:space="preserve">이전</w:t>
+      </w:r>
+      <w:r>
+        <w:t xml:space="preserve">에 Layer Normalization을 적용하는 Pre-LayerNorm 구조를 따른다. 핵심은</w:t>
+      </w:r>
+      <w:r>
+        <w:t xml:space="preserve"> </w:t>
+      </w:r>
+      <w:r>
+        <w:rPr>
+          <w:b/>
+          <w:bCs/>
+        </w:rPr>
+        <w:t xml:space="preserve">인과 마스킹</w:t>
+      </w:r>
+      <w:r>
+        <w:t xml:space="preserve">으로, attention 점수의 상삼각(미래 토큰) 위치를</w:t>
       </w:r>
       <w:r>
         <w:t xml:space="preserve"> </w:t>
       </w:r>
       <m:oMath>
         <m:r>
-          <m:t>X</m:t>
+          <m:rPr>
+            <m:sty m:val="p"/>
+          </m:rPr>
+          <m:t>−</m:t>
         </m:r>
         <m:r>
           <m:rPr>
             <m:sty m:val="p"/>
           </m:rPr>
-          <m:t>∈</m:t>
-        </m:r>
-        <m:sSup>
-          <m:e>
-            <m:r>
-              <m:rPr>
-                <m:scr m:val="double-struck"/>
-                <m:sty m:val="p"/>
-              </m:rPr>
-              <m:t>R</m:t>
-            </m:r>
-          </m:e>
-          <m:sup>
-            <m:r>
-              <m:t>B</m:t>
-            </m:r>
-            <m:r>
-              <m:rPr>
-                <m:sty m:val="p"/>
-              </m:rPr>
-              <m:t>×</m:t>
-            </m:r>
-            <m:r>
-              <m:t>T</m:t>
-            </m:r>
-            <m:r>
-              <m:rPr>
-                <m:sty m:val="p"/>
-              </m:rPr>
-              <m:t>×</m:t>
-            </m:r>
-            <m:r>
-              <m:t>H</m:t>
-            </m:r>
-          </m:sup>
-        </m:sSup>
-      </m:oMath>
-      <w:r>
-        <w:t xml:space="preserve">에 대해 query/key/value를 선형 변환으로 사영하고,</w:t>
-      </w:r>
-      <w:r>
-        <w:t xml:space="preserve"> </w:t>
-      </w:r>
-      <m:oMath>
-        <m:r>
-          <m:t>h</m:t>
+          <m:t>∞</m:t>
         </m:r>
       </m:oMath>
       <w:r>
-        <w:t xml:space="preserve">개의 헤드로 분할한다(</w:t>
-      </w:r>
-      <m:oMath>
-        <m:sSub>
-          <m:e>
-            <m:r>
-              <m:t>d</m:t>
-            </m:r>
-          </m:e>
-          <m:sub>
-            <m:r>
-              <m:t>k</m:t>
-            </m:r>
-          </m:sub>
-        </m:sSub>
-        <m:r>
-          <m:rPr>
-            <m:sty m:val="p"/>
-          </m:rPr>
-          <m:t>=</m:t>
-        </m:r>
-        <m:r>
-          <m:t>H</m:t>
-        </m:r>
-        <m:r>
-          <m:rPr>
-            <m:sty m:val="p"/>
-          </m:rPr>
-          <m:t>/</m:t>
-        </m:r>
-        <m:r>
-          <m:t>h</m:t>
-        </m:r>
-      </m:oMath>
-      <w:r>
-        <w:t xml:space="preserve">). 각 헤드에서 scaled dot-product attention을 계산한다:</w:t>
+        <w:t xml:space="preserve">로 만들어 각 토큰이 과거 토큰만 참조하게 한다:</w:t>
       </w:r>
     </w:p>
     <w:p>
@@ -1010,7 +967,7 @@
             <m:e>
               <m:f>
                 <m:fPr>
-                  <m:type m:val="bar"/>
+                  <m:type m:val="lin"/>
                 </m:fPr>
                 <m:num>
                   <m:r>
@@ -1112,36 +1069,139 @@
         <w:pStyle w:val="FirstParagraph"/>
       </w:pPr>
       <w:r>
-        <w:t xml:space="preserve">여기서 인과 마스크</w:t>
+        <w:t xml:space="preserve">구현(</w:t>
+      </w:r>
+      <w:r>
+        <w:rPr>
+          <w:rStyle w:val="VerbatimChar"/>
+        </w:rPr>
+        <w:t xml:space="preserve">modules/attention.py</w:t>
+      </w:r>
+      <w:r>
+        <w:t xml:space="preserve">)에서는</w:t>
+      </w:r>
+      <w:r>
+        <w:t xml:space="preserve"> </w:t>
+      </w:r>
+      <w:r>
+        <w:rPr>
+          <w:rStyle w:val="VerbatimChar"/>
+        </w:rPr>
+        <w:t xml:space="preserve">torch.triu(..., diagonal=1)</w:t>
+      </w:r>
+      <w:r>
+        <w:t xml:space="preserve">로 인과 마스크를 만들고 패딩 마스크는 점수에 가산한다. 블록(</w:t>
+      </w:r>
+      <w:r>
+        <w:rPr>
+          <w:rStyle w:val="VerbatimChar"/>
+        </w:rPr>
+        <w:t xml:space="preserve">modules/gpt2_layer.py</w:t>
+      </w:r>
+      <w:r>
+        <w:t xml:space="preserve">)은 (LN→Attention→Dropout→잔차) 후 (LN→FFN(GELU)→Dropout→잔차) 순으로 진행되고, 전체 모델(</w:t>
+      </w:r>
+      <w:r>
+        <w:rPr>
+          <w:rStyle w:val="VerbatimChar"/>
+        </w:rPr>
+        <w:t xml:space="preserve">models/gpt2.py</w:t>
+      </w:r>
+      <w:r>
+        <w:t xml:space="preserve">)은 토큰+위치 임베딩 →</w:t>
       </w:r>
       <w:r>
         <w:t xml:space="preserve"> </w:t>
       </w:r>
       <m:oMath>
-        <m:sSub>
-          <m:e>
-            <m:r>
-              <m:t>M</m:t>
-            </m:r>
-          </m:e>
-          <m:sub>
-            <m:r>
-              <m:rPr>
-                <m:nor/>
-                <m:sty m:val="p"/>
-              </m:rPr>
-              <m:t>causal</m:t>
-            </m:r>
-          </m:sub>
-        </m:sSub>
+        <m:r>
+          <m:t>L</m:t>
+        </m:r>
       </m:oMath>
       <w:r>
-        <w:t xml:space="preserve">는 상삼각(strictly upper-triangular) 위치를</w:t>
+        <w:t xml:space="preserve">개 블록 → 최종 LN을 거친다. 감정 분류에는 시퀀스</w:t>
+      </w:r>
+      <w:r>
+        <w:t xml:space="preserve"> </w:t>
+      </w:r>
+      <w:r>
+        <w:rPr>
+          <w:b/>
+          <w:bCs/>
+        </w:rPr>
+        <w:t xml:space="preserve">마지막 토큰</w:t>
+      </w:r>
+      <w:r>
+        <w:t xml:space="preserve">의 표현을 사용한다.</w:t>
+      </w:r>
+    </w:p>
+    <w:bookmarkEnd w:id="16"/>
+    <w:bookmarkStart w:id="17" w:name="adamw-옵티마이저"/>
+    <w:p>
+      <w:pPr>
+        <w:pStyle w:val="Heading3"/>
+      </w:pPr>
+      <w:r>
+        <w:t xml:space="preserve">3.2 AdamW 옵티마이저</w:t>
+      </w:r>
+    </w:p>
+    <w:p>
+      <w:pPr>
+        <w:pStyle w:val="FirstParagraph"/>
+      </w:pPr>
+      <w:r>
+        <w:rPr>
+          <w:rStyle w:val="VerbatimChar"/>
+        </w:rPr>
+        <w:t xml:space="preserve">optimizer.py</w:t>
+      </w:r>
+      <w:r>
+        <w:t xml:space="preserve">의</w:t>
+      </w:r>
+      <w:r>
+        <w:t xml:space="preserve"> </w:t>
+      </w:r>
+      <w:r>
+        <w:rPr>
+          <w:rStyle w:val="VerbatimChar"/>
+        </w:rPr>
+        <w:t xml:space="preserve">step()</w:t>
+      </w:r>
+      <w:r>
+        <w:t xml:space="preserve">에서 Adam의 1·2차 모멘트 추정과 편향 보정을 구현하고,</w:t>
+      </w:r>
+      <w:r>
+        <w:t xml:space="preserve"> </w:t>
+      </w:r>
+      <w:r>
+        <w:rPr>
+          <w:b/>
+          <w:bCs/>
+        </w:rPr>
+        <w:t xml:space="preserve">가중치 감쇠를 그래디언트 갱신과 분리(decoupled weight decay)하여</w:t>
+      </w:r>
+      <w:r>
+        <w:t xml:space="preserve"> </w:t>
+      </w:r>
+      <w:r>
+        <w:t xml:space="preserve">적용한다 — 적응적 학습률 갱신</w:t>
       </w:r>
       <w:r>
         <w:t xml:space="preserve"> </w:t>
       </w:r>
       <m:oMath>
+        <m:r>
+          <m:t>θ</m:t>
+        </m:r>
+        <m:r>
+          <m:rPr>
+            <m:sty m:val="p"/>
+          </m:rPr>
+          <m:t>←</m:t>
+        </m:r>
+        <m:r>
+          <m:t>θ</m:t>
+        </m:r>
         <m:r>
           <m:rPr>
             <m:sty m:val="p"/>
@@ -1149,1558 +1209,155 @@
           <m:t>−</m:t>
         </m:r>
         <m:r>
+          <m:t>α</m:t>
+        </m:r>
+        <m:r>
+          <m:t> </m:t>
+        </m:r>
+        <m:acc>
+          <m:accPr>
+            <m:chr m:val="̂"/>
+          </m:accPr>
+          <m:e>
+            <m:r>
+              <m:t>m</m:t>
+            </m:r>
+          </m:e>
+        </m:acc>
+        <m:r>
           <m:rPr>
             <m:sty m:val="p"/>
           </m:rPr>
-          <m:t>∞</m:t>
-        </m:r>
-      </m:oMath>
-      <w:r>
-        <w:t xml:space="preserve">로 설정하여 각 위치가 미래 토큰을 참조하지 못하도록 한다:</w:t>
-      </w:r>
-    </w:p>
-    <w:p>
-      <w:pPr>
-        <w:pStyle w:val="BodyText"/>
-      </w:pPr>
-      <m:oMathPara>
-        <m:oMathParaPr>
-          <m:jc m:val="center"/>
-        </m:oMathParaPr>
-        <m:oMath>
-          <m:r>
-            <m:rPr>
-              <m:sty m:val="p"/>
-            </m:rPr>
-            <m:t>(</m:t>
-          </m:r>
-          <m:sSub>
-            <m:e>
-              <m:r>
-                <m:t>M</m:t>
-              </m:r>
-            </m:e>
-            <m:sub>
-              <m:r>
-                <m:rPr>
-                  <m:nor/>
-                  <m:sty m:val="p"/>
-                </m:rPr>
-                <m:t>causal</m:t>
-              </m:r>
-            </m:sub>
-          </m:sSub>
-          <m:sSub>
-            <m:e>
-              <m:r>
-                <m:rPr>
-                  <m:sty m:val="p"/>
-                </m:rPr>
-                <m:t>)</m:t>
-              </m:r>
-            </m:e>
-            <m:sub>
-              <m:r>
-                <m:t>i</m:t>
-              </m:r>
-              <m:r>
-                <m:t>j</m:t>
-              </m:r>
-            </m:sub>
-          </m:sSub>
-          <m:r>
-            <m:rPr>
-              <m:sty m:val="p"/>
-            </m:rPr>
-            <m:t>=</m:t>
-          </m:r>
-          <m:d>
-            <m:dPr>
-              <m:begChr m:val="{"/>
-              <m:sepChr m:val=""/>
-              <m:endChr m:val=""/>
-              <m:grow/>
-            </m:dPr>
-            <m:e>
-              <m:m>
-                <m:mPr>
-                  <m:baseJc m:val="center"/>
-                  <m:plcHide m:val="on"/>
-                  <m:mcs>
-                    <m:mc>
-                      <m:mcPr>
-                        <m:mcJc m:val="left"/>
-                        <m:count m:val="1"/>
-                      </m:mcPr>
-                    </m:mc>
-                    <m:mc>
-                      <m:mcPr>
-                        <m:mcJc m:val="left"/>
-                        <m:count m:val="1"/>
-                      </m:mcPr>
-                    </m:mc>
-                  </m:mcs>
-                </m:mPr>
-                <m:mr>
-                  <m:e>
-                    <m:r>
-                      <m:rPr>
-                        <m:sty m:val="p"/>
-                      </m:rPr>
-                      <m:t>−</m:t>
-                    </m:r>
-                    <m:r>
-                      <m:rPr>
-                        <m:sty m:val="p"/>
-                      </m:rPr>
-                      <m:t>∞</m:t>
-                    </m:r>
-                  </m:e>
-                  <m:e>
-                    <m:r>
-                      <m:t>j</m:t>
-                    </m:r>
-                    <m:r>
-                      <m:rPr>
-                        <m:sty m:val="p"/>
-                      </m:rPr>
-                      <m:t>&gt;</m:t>
-                    </m:r>
-                    <m:r>
-                      <m:t>i</m:t>
-                    </m:r>
-                  </m:e>
-                </m:mr>
-                <m:mr>
-                  <m:e>
-                    <m:r>
-                      <m:t>0</m:t>
-                    </m:r>
-                  </m:e>
-                  <m:e>
-                    <m:r>
-                      <m:t>j</m:t>
-                    </m:r>
-                    <m:r>
-                      <m:rPr>
-                        <m:sty m:val="p"/>
-                      </m:rPr>
-                      <m:t>≤</m:t>
-                    </m:r>
-                    <m:r>
-                      <m:t>i</m:t>
-                    </m:r>
-                  </m:e>
-                </m:mr>
-              </m:m>
-            </m:e>
-          </m:d>
-        </m:oMath>
-      </m:oMathPara>
-    </w:p>
-    <w:p>
-      <w:pPr>
-        <w:pStyle w:val="FirstParagraph"/>
-      </w:pPr>
-      <m:oMath>
-        <m:sSub>
-          <m:e>
-            <m:r>
-              <m:t>M</m:t>
-            </m:r>
-          </m:e>
-          <m:sub>
-            <m:r>
-              <m:rPr>
-                <m:nor/>
-                <m:sty m:val="p"/>
-              </m:rPr>
-              <m:t>pad</m:t>
-            </m:r>
-          </m:sub>
-        </m:sSub>
-      </m:oMath>
-      <w:r>
-        <w:t xml:space="preserve">는 패딩 위치를 큰 음수로 만들어 softmax 이후 가중치가 0에 수렴하게 한다. 구현에서는</w:t>
-      </w:r>
-      <w:r>
-        <w:t xml:space="preserve"> </w:t>
-      </w:r>
-      <w:r>
-        <w:rPr>
-          <w:rStyle w:val="VerbatimChar"/>
-        </w:rPr>
-        <w:t xml:space="preserve">torch.triu(..., diagonal=1)</w:t>
-      </w:r>
-      <w:r>
-        <w:t xml:space="preserve">로 인과 마스크를 생성한 뒤</w:t>
-      </w:r>
-      <w:r>
-        <w:t xml:space="preserve"> </w:t>
-      </w:r>
-      <w:r>
-        <w:rPr>
-          <w:rStyle w:val="VerbatimChar"/>
-        </w:rPr>
-        <w:t xml:space="preserve">masked_fill</w:t>
-      </w:r>
-      <w:r>
-        <w:t xml:space="preserve">로 적용하고, 패딩 마스크는 점수에 가산한다. 정규화된 attention 가중치에 dropout을 적용한 후</w:t>
-      </w:r>
-      <w:r>
-        <w:t xml:space="preserve"> </w:t>
-      </w:r>
-      <m:oMath>
-        <m:r>
-          <m:t>V</m:t>
-        </m:r>
-      </m:oMath>
-      <w:r>
-        <w:t xml:space="preserve">와 곱하여 컨텍스트 벡터를 얻고, 멀티헤드를 다시</w:t>
-      </w:r>
-      <w:r>
-        <w:t xml:space="preserve"> </w:t>
-      </w:r>
-      <m:oMath>
-        <m:r>
-          <m:t>H</m:t>
-        </m:r>
-      </m:oMath>
-      <w:r>
-        <w:t xml:space="preserve"> </w:t>
-      </w:r>
-      <w:r>
-        <w:t xml:space="preserve">차원으로 결합한다.</w:t>
-      </w:r>
-    </w:p>
-    <w:bookmarkEnd w:id="16"/>
-    <w:bookmarkStart w:id="17" w:name="pre-layernorm-transformer-블록"/>
-    <w:p>
-      <w:pPr>
-        <w:pStyle w:val="Heading3"/>
-      </w:pPr>
-      <w:r>
-        <w:t xml:space="preserve">3.2 Pre-LayerNorm Transformer 블록</w:t>
-      </w:r>
-    </w:p>
-    <w:p>
-      <w:pPr>
-        <w:pStyle w:val="FirstParagraph"/>
-      </w:pPr>
-      <w:r>
-        <w:t xml:space="preserve">GPT-2는 각 서브레이어</w:t>
-      </w:r>
-      <w:r>
-        <w:t xml:space="preserve"> </w:t>
-      </w:r>
-      <w:r>
-        <w:rPr>
-          <w:b/>
-          <w:bCs/>
-        </w:rPr>
-        <w:t xml:space="preserve">이전</w:t>
-      </w:r>
-      <w:r>
-        <w:t xml:space="preserve">에 Layer Normalization을 적용하는 Pre-LayerNorm 구조를 사용한다. 블록의 연산은 다음과 같다:</w:t>
-      </w:r>
-    </w:p>
-    <w:p>
-      <w:pPr>
-        <w:pStyle w:val="BodyText"/>
-      </w:pPr>
-      <m:oMathPara>
-        <m:oMathParaPr>
-          <m:jc m:val="center"/>
-        </m:oMathParaPr>
-        <m:oMath>
-          <m:eqArr>
-            <m:e>
-              <m:sSup>
-                <m:e>
-                  <m:r>
-                    <m:t>H</m:t>
-                  </m:r>
-                </m:e>
-                <m:sup>
-                  <m:r>
-                    <m:rPr>
-                      <m:sty m:val="p"/>
-                    </m:rPr>
-                    <m:t>′</m:t>
-                  </m:r>
-                </m:sup>
-              </m:sSup>
-              <m:r>
-                <m:t>&amp;</m:t>
-              </m:r>
-              <m:r>
-                <m:rPr>
-                  <m:sty m:val="p"/>
-                </m:rPr>
-                <m:t>=</m:t>
-              </m:r>
-              <m:r>
-                <m:t>H</m:t>
-              </m:r>
-              <m:r>
-                <m:rPr>
-                  <m:sty m:val="p"/>
-                </m:rPr>
-                <m:t>+</m:t>
-              </m:r>
-              <m:r>
-                <m:rPr>
-                  <m:nor/>
-                  <m:sty m:val="p"/>
-                </m:rPr>
-                <m:t>Dropout</m:t>
-              </m:r>
-              <m:d>
-                <m:dPr>
-                  <m:begChr m:val="("/>
-                  <m:sepChr m:val=""/>
-                  <m:endChr m:val=")"/>
-                  <m:grow/>
-                </m:dPr>
-                <m:e>
-                  <m:sSub>
-                    <m:e>
-                      <m:r>
-                        <m:t>W</m:t>
-                      </m:r>
-                    </m:e>
-                    <m:sub>
-                      <m:r>
-                        <m:t>o</m:t>
-                      </m:r>
-                    </m:sub>
-                  </m:sSub>
-                  <m:r>
-                    <m:rPr>
-                      <m:sty m:val="p"/>
-                    </m:rPr>
-                    <m:t>⋅</m:t>
-                  </m:r>
-                  <m:r>
-                    <m:rPr>
-                      <m:nor/>
-                      <m:sty m:val="p"/>
-                    </m:rPr>
-                    <m:t>Attention</m:t>
-                  </m:r>
-                  <m:r>
-                    <m:rPr>
-                      <m:sty m:val="p"/>
-                    </m:rPr>
-                    <m:t>(</m:t>
-                  </m:r>
-                  <m:sSub>
-                    <m:e>
-                      <m:r>
-                        <m:rPr>
-                          <m:nor/>
-                          <m:sty m:val="p"/>
-                        </m:rPr>
-                        <m:t>LN</m:t>
-                      </m:r>
-                    </m:e>
-                    <m:sub>
-                      <m:r>
-                        <m:t>1</m:t>
-                      </m:r>
-                    </m:sub>
-                  </m:sSub>
-                  <m:r>
-                    <m:rPr>
-                      <m:sty m:val="p"/>
-                    </m:rPr>
-                    <m:t>(</m:t>
-                  </m:r>
-                  <m:r>
-                    <m:t>H</m:t>
-                  </m:r>
-                  <m:r>
-                    <m:rPr>
-                      <m:sty m:val="p"/>
-                    </m:rPr>
-                    <m:t>)</m:t>
-                  </m:r>
-                  <m:r>
-                    <m:rPr>
-                      <m:sty m:val="p"/>
-                    </m:rPr>
-                    <m:t>)</m:t>
-                  </m:r>
-                </m:e>
-              </m:d>
-            </m:e>
-            <m:e>
-              <m:sSup>
-                <m:e>
-                  <m:r>
-                    <m:t>H</m:t>
-                  </m:r>
-                </m:e>
-                <m:sup>
-                  <m:r>
-                    <m:rPr>
-                      <m:sty m:val="p"/>
-                    </m:rPr>
-                    <m:t>″</m:t>
-                  </m:r>
-                </m:sup>
-              </m:sSup>
-              <m:r>
-                <m:t>&amp;</m:t>
-              </m:r>
-              <m:r>
-                <m:rPr>
-                  <m:sty m:val="p"/>
-                </m:rPr>
-                <m:t>=</m:t>
-              </m:r>
-              <m:sSup>
-                <m:e>
-                  <m:r>
-                    <m:t>H</m:t>
-                  </m:r>
-                </m:e>
-                <m:sup>
-                  <m:r>
-                    <m:rPr>
-                      <m:sty m:val="p"/>
-                    </m:rPr>
-                    <m:t>′</m:t>
-                  </m:r>
-                </m:sup>
-              </m:sSup>
-              <m:r>
-                <m:rPr>
-                  <m:sty m:val="p"/>
-                </m:rPr>
-                <m:t>+</m:t>
-              </m:r>
-              <m:r>
-                <m:rPr>
-                  <m:nor/>
-                  <m:sty m:val="p"/>
-                </m:rPr>
-                <m:t>Dropout</m:t>
-              </m:r>
-              <m:d>
-                <m:dPr>
-                  <m:begChr m:val="("/>
-                  <m:sepChr m:val=""/>
-                  <m:endChr m:val=")"/>
-                  <m:grow/>
-                </m:dPr>
-                <m:e>
-                  <m:sSub>
-                    <m:e>
-                      <m:r>
-                        <m:t>W</m:t>
-                      </m:r>
-                    </m:e>
-                    <m:sub>
-                      <m:r>
-                        <m:t>2</m:t>
-                      </m:r>
-                    </m:sub>
-                  </m:sSub>
-                  <m:r>
-                    <m:rPr>
-                      <m:sty m:val="p"/>
-                    </m:rPr>
-                    <m:t>⋅</m:t>
-                  </m:r>
-                  <m:r>
-                    <m:rPr>
-                      <m:nor/>
-                      <m:sty m:val="p"/>
-                    </m:rPr>
-                    <m:t>GELU</m:t>
-                  </m:r>
-                  <m:r>
-                    <m:rPr>
-                      <m:sty m:val="p"/>
-                    </m:rPr>
-                    <m:t>(</m:t>
-                  </m:r>
-                  <m:sSub>
-                    <m:e>
-                      <m:r>
-                        <m:t>W</m:t>
-                      </m:r>
-                    </m:e>
-                    <m:sub>
-                      <m:r>
-                        <m:t>1</m:t>
-                      </m:r>
-                    </m:sub>
-                  </m:sSub>
-                  <m:r>
-                    <m:rPr>
-                      <m:sty m:val="p"/>
-                    </m:rPr>
-                    <m:t>⋅</m:t>
-                  </m:r>
-                  <m:sSub>
-                    <m:e>
-                      <m:r>
-                        <m:rPr>
-                          <m:nor/>
-                          <m:sty m:val="p"/>
-                        </m:rPr>
-                        <m:t>LN</m:t>
-                      </m:r>
-                    </m:e>
-                    <m:sub>
-                      <m:r>
-                        <m:t>2</m:t>
-                      </m:r>
-                    </m:sub>
-                  </m:sSub>
-                  <m:r>
-                    <m:rPr>
-                      <m:sty m:val="p"/>
-                    </m:rPr>
-                    <m:t>(</m:t>
-                  </m:r>
-                  <m:sSup>
-                    <m:e>
-                      <m:r>
-                        <m:t>H</m:t>
-                      </m:r>
-                    </m:e>
-                    <m:sup>
-                      <m:r>
-                        <m:rPr>
-                          <m:sty m:val="p"/>
-                        </m:rPr>
-                        <m:t>′</m:t>
-                      </m:r>
-                    </m:sup>
-                  </m:sSup>
-                  <m:r>
-                    <m:rPr>
-                      <m:sty m:val="p"/>
-                    </m:rPr>
-                    <m:t>)</m:t>
-                  </m:r>
-                  <m:r>
-                    <m:rPr>
-                      <m:sty m:val="p"/>
-                    </m:rPr>
-                    <m:t>)</m:t>
-                  </m:r>
-                </m:e>
-              </m:d>
-            </m:e>
-          </m:eqArr>
-        </m:oMath>
-      </m:oMathPara>
-    </w:p>
-    <w:p>
-      <w:pPr>
-        <w:pStyle w:val="FirstParagraph"/>
-      </w:pPr>
-      <w:r>
-        <w:t xml:space="preserve">즉 (LN → Attention → Dense → Dropout → 잔차합) 후 (LN → FFN → Dropout → 잔차합) 순서로 진행된다. 헬퍼</w:t>
-      </w:r>
-      <w:r>
-        <w:t xml:space="preserve"> </w:t>
-      </w:r>
-      <w:r>
-        <w:rPr>
-          <w:rStyle w:val="VerbatimChar"/>
-        </w:rPr>
-        <w:t xml:space="preserve">add(input, output, dense, dropout)</w:t>
-      </w:r>
-      <w:r>
-        <w:t xml:space="preserve">는</w:t>
-      </w:r>
-      <w:r>
-        <w:t xml:space="preserve"> </w:t>
-      </w:r>
-      <w:r>
-        <w:rPr>
-          <w:rStyle w:val="VerbatimChar"/>
-        </w:rPr>
-        <w:t xml:space="preserve">input + dropout(dense(output))</w:t>
-      </w:r>
-      <w:r>
-        <w:t xml:space="preserve">을 수행하며, 이 단계에서는 Layer Normalization을 적용하지 않는다(LN은 서브레이어 입력에서 이미 적용됨).</w:t>
-      </w:r>
-    </w:p>
-    <w:bookmarkEnd w:id="17"/>
-    <w:bookmarkStart w:id="18" w:name="gpt-2-모델"/>
-    <w:p>
-      <w:pPr>
-        <w:pStyle w:val="Heading3"/>
-      </w:pPr>
-      <w:r>
-        <w:t xml:space="preserve">3.3 GPT-2 모델</w:t>
-      </w:r>
-    </w:p>
-    <w:p>
-      <w:pPr>
-        <w:pStyle w:val="FirstParagraph"/>
-      </w:pPr>
-      <w:r>
-        <w:t xml:space="preserve">토큰 임베딩과 학습 가능한 위치 임베딩(learnable positional embedding)을 더한 뒤</w:t>
-      </w:r>
-      <w:r>
-        <w:t xml:space="preserve"> </w:t>
-      </w:r>
-      <m:oMath>
-        <m:r>
-          <m:t>L</m:t>
-        </m:r>
-      </m:oMath>
-      <w:r>
-        <w:t xml:space="preserve">개의</w:t>
-      </w:r>
-      <w:r>
-        <w:t xml:space="preserve"> </w:t>
-      </w:r>
-      <w:r>
-        <w:rPr>
-          <w:rStyle w:val="VerbatimChar"/>
-        </w:rPr>
-        <w:t xml:space="preserve">GPT2Layer</w:t>
-      </w:r>
-      <w:r>
-        <w:t xml:space="preserve">를 통과시키고, 마지막에 최종 Layer Normalization을 적용한다. 감정 분류에는 시퀀스의</w:t>
-      </w:r>
-      <w:r>
-        <w:t xml:space="preserve"> </w:t>
-      </w:r>
-      <w:r>
-        <w:rPr>
-          <w:b/>
-          <w:bCs/>
-        </w:rPr>
-        <w:t xml:space="preserve">마지막 토큰</w:t>
-      </w:r>
-      <w:r>
-        <w:t xml:space="preserve">의 은닉 표현을 문장 표현으로 사용한다. 구현 정합성은 HuggingFace</w:t>
-      </w:r>
-      <w:r>
-        <w:t xml:space="preserve"> </w:t>
-      </w:r>
-      <w:r>
-        <w:rPr>
-          <w:rStyle w:val="VerbatimChar"/>
-        </w:rPr>
-        <w:t xml:space="preserve">GPT2Model</w:t>
-      </w:r>
-      <w:r>
-        <w:t xml:space="preserve">과 동일 입력에 대한 마지막 은닉 상태를 비교하여(</w:t>
-      </w:r>
-      <w:r>
-        <w:rPr>
-          <w:rStyle w:val="VerbatimChar"/>
-        </w:rPr>
-        <w:t xml:space="preserve">atol=0.1, rtol=0.01</w:t>
-      </w:r>
-      <w:r>
-        <w:t xml:space="preserve">) 검증하였다.</w:t>
-      </w:r>
-    </w:p>
-    <w:bookmarkEnd w:id="18"/>
-    <w:bookmarkStart w:id="19" w:name="adamw-옵티마이저"/>
-    <w:p>
-      <w:pPr>
-        <w:pStyle w:val="Heading3"/>
-      </w:pPr>
-      <w:r>
-        <w:t xml:space="preserve">3.4 AdamW 옵티마이저</w:t>
-      </w:r>
-    </w:p>
-    <w:p>
-      <w:pPr>
-        <w:pStyle w:val="FirstParagraph"/>
-      </w:pPr>
-      <w:r>
-        <w:t xml:space="preserve">각 파라미터</w:t>
-      </w:r>
-      <w:r>
-        <w:t xml:space="preserve"> </w:t>
-      </w:r>
-      <m:oMath>
-        <m:r>
-          <m:t>θ</m:t>
-        </m:r>
-      </m:oMath>
-      <w:r>
-        <w:t xml:space="preserve">에 대해 1차/2차 모멘트를 지수이동평균으로 갱신한다:</w:t>
-      </w:r>
-    </w:p>
-    <w:p>
-      <w:pPr>
-        <w:pStyle w:val="BodyText"/>
-      </w:pPr>
-      <m:oMathPara>
-        <m:oMathParaPr>
-          <m:jc m:val="center"/>
-        </m:oMathParaPr>
-        <m:oMath>
-          <m:sSub>
-            <m:e>
-              <m:r>
-                <m:t>m</m:t>
-              </m:r>
-            </m:e>
-            <m:sub>
-              <m:r>
-                <m:t>t</m:t>
-              </m:r>
-            </m:sub>
-          </m:sSub>
-          <m:r>
-            <m:rPr>
-              <m:sty m:val="p"/>
-            </m:rPr>
-            <m:t>=</m:t>
-          </m:r>
-          <m:sSub>
-            <m:e>
-              <m:r>
-                <m:t>β</m:t>
-              </m:r>
-            </m:e>
-            <m:sub>
-              <m:r>
-                <m:t>1</m:t>
-              </m:r>
-            </m:sub>
-          </m:sSub>
-          <m:sSub>
-            <m:e>
-              <m:r>
-                <m:t>m</m:t>
-              </m:r>
-            </m:e>
-            <m:sub>
-              <m:r>
-                <m:t>t</m:t>
-              </m:r>
-              <m:r>
-                <m:rPr>
-                  <m:sty m:val="p"/>
-                </m:rPr>
-                <m:t>−</m:t>
-              </m:r>
-              <m:r>
-                <m:t>1</m:t>
-              </m:r>
-            </m:sub>
-          </m:sSub>
-          <m:r>
-            <m:rPr>
-              <m:sty m:val="p"/>
-            </m:rPr>
-            <m:t>+</m:t>
-          </m:r>
-          <m:r>
-            <m:rPr>
-              <m:sty m:val="p"/>
-            </m:rPr>
-            <m:t>(</m:t>
-          </m:r>
-          <m:r>
-            <m:t>1</m:t>
-          </m:r>
-          <m:r>
-            <m:rPr>
-              <m:sty m:val="p"/>
-            </m:rPr>
-            <m:t>−</m:t>
-          </m:r>
-          <m:sSub>
-            <m:e>
-              <m:r>
-                <m:t>β</m:t>
-              </m:r>
-            </m:e>
-            <m:sub>
-              <m:r>
-                <m:t>1</m:t>
-              </m:r>
-            </m:sub>
-          </m:sSub>
-          <m:r>
-            <m:rPr>
-              <m:sty m:val="p"/>
-            </m:rPr>
-            <m:t>)</m:t>
-          </m:r>
-          <m:sSub>
-            <m:e>
-              <m:r>
-                <m:t>g</m:t>
-              </m:r>
-            </m:e>
-            <m:sub>
-              <m:r>
-                <m:t>t</m:t>
-              </m:r>
-            </m:sub>
-          </m:sSub>
-          <m:r>
-            <m:rPr>
-              <m:sty m:val="p"/>
-            </m:rPr>
-            <m:t>,</m:t>
-          </m:r>
-          <m:r>
-            <m:t>  </m:t>
-          </m:r>
-          <m:sSub>
-            <m:e>
-              <m:r>
-                <m:t>v</m:t>
-              </m:r>
-            </m:e>
-            <m:sub>
-              <m:r>
-                <m:t>t</m:t>
-              </m:r>
-            </m:sub>
-          </m:sSub>
-          <m:r>
-            <m:rPr>
-              <m:sty m:val="p"/>
-            </m:rPr>
-            <m:t>=</m:t>
-          </m:r>
-          <m:sSub>
-            <m:e>
-              <m:r>
-                <m:t>β</m:t>
-              </m:r>
-            </m:e>
-            <m:sub>
-              <m:r>
-                <m:t>2</m:t>
-              </m:r>
-            </m:sub>
-          </m:sSub>
-          <m:sSub>
-            <m:e>
-              <m:r>
-                <m:t>v</m:t>
-              </m:r>
-            </m:e>
-            <m:sub>
-              <m:r>
-                <m:t>t</m:t>
-              </m:r>
-              <m:r>
-                <m:rPr>
-                  <m:sty m:val="p"/>
-                </m:rPr>
-                <m:t>−</m:t>
-              </m:r>
-              <m:r>
-                <m:t>1</m:t>
-              </m:r>
-            </m:sub>
-          </m:sSub>
-          <m:r>
-            <m:rPr>
-              <m:sty m:val="p"/>
-            </m:rPr>
-            <m:t>+</m:t>
-          </m:r>
-          <m:r>
-            <m:rPr>
-              <m:sty m:val="p"/>
-            </m:rPr>
-            <m:t>(</m:t>
-          </m:r>
-          <m:r>
-            <m:t>1</m:t>
-          </m:r>
-          <m:r>
-            <m:rPr>
-              <m:sty m:val="p"/>
-            </m:rPr>
-            <m:t>−</m:t>
-          </m:r>
-          <m:sSub>
-            <m:e>
-              <m:r>
-                <m:t>β</m:t>
-              </m:r>
-            </m:e>
-            <m:sub>
-              <m:r>
-                <m:t>2</m:t>
-              </m:r>
-            </m:sub>
-          </m:sSub>
-          <m:r>
-            <m:rPr>
-              <m:sty m:val="p"/>
-            </m:rPr>
-            <m:t>)</m:t>
-          </m:r>
-          <m:sSubSup>
-            <m:e>
-              <m:r>
-                <m:t>g</m:t>
-              </m:r>
-            </m:e>
-            <m:sub>
-              <m:r>
-                <m:t>t</m:t>
-              </m:r>
-            </m:sub>
-            <m:sup>
-              <m:r>
-                <m:t>2</m:t>
-              </m:r>
-            </m:sup>
-          </m:sSubSup>
-        </m:oMath>
-      </m:oMathPara>
-    </w:p>
-    <w:p>
-      <w:pPr>
-        <w:pStyle w:val="FirstParagraph"/>
-      </w:pPr>
-      <w:r>
-        <w:t xml:space="preserve">편향 보정을 반영한 스텝 크기는 다음과 같다:</w:t>
-      </w:r>
-    </w:p>
-    <w:p>
-      <w:pPr>
-        <w:pStyle w:val="BodyText"/>
-      </w:pPr>
-      <m:oMathPara>
-        <m:oMathParaPr>
-          <m:jc m:val="center"/>
-        </m:oMathParaPr>
-        <m:oMath>
-          <m:r>
-            <m:rPr>
-              <m:nor/>
-              <m:sty m:val="p"/>
-            </m:rPr>
-            <m:t>step_size</m:t>
-          </m:r>
-          <m:r>
-            <m:rPr>
-              <m:sty m:val="p"/>
-            </m:rPr>
-            <m:t>=</m:t>
-          </m:r>
-          <m:r>
-            <m:t>α</m:t>
-          </m:r>
-          <m:r>
-            <m:rPr>
-              <m:sty m:val="p"/>
-            </m:rPr>
-            <m:t>⋅</m:t>
-          </m:r>
-          <m:f>
-            <m:fPr>
-              <m:type m:val="bar"/>
-            </m:fPr>
-            <m:num>
-              <m:rad>
-                <m:radPr>
-                  <m:degHide m:val="on"/>
-                </m:radPr>
-                <m:deg/>
-                <m:e>
-                  <m:r>
-                    <m:t>1</m:t>
-                  </m:r>
-                  <m:r>
-                    <m:rPr>
-                      <m:sty m:val="p"/>
-                    </m:rPr>
-                    <m:t>−</m:t>
-                  </m:r>
-                  <m:sSubSup>
-                    <m:e>
-                      <m:r>
-                        <m:t>β</m:t>
-                      </m:r>
-                    </m:e>
-                    <m:sub>
-                      <m:r>
-                        <m:t>2</m:t>
-                      </m:r>
-                    </m:sub>
-                    <m:sup>
-                      <m:r>
-                        <m:t> </m:t>
-                      </m:r>
-                      <m:r>
-                        <m:t>t</m:t>
-                      </m:r>
-                    </m:sup>
-                  </m:sSubSup>
-                </m:e>
-              </m:rad>
-            </m:num>
-            <m:den>
-              <m:r>
-                <m:t>1</m:t>
-              </m:r>
-              <m:r>
-                <m:rPr>
-                  <m:sty m:val="p"/>
-                </m:rPr>
-                <m:t>−</m:t>
-              </m:r>
-              <m:sSubSup>
-                <m:e>
-                  <m:r>
-                    <m:t>β</m:t>
-                  </m:r>
-                </m:e>
-                <m:sub>
-                  <m:r>
-                    <m:t>1</m:t>
-                  </m:r>
-                </m:sub>
-                <m:sup>
-                  <m:r>
-                    <m:t> </m:t>
-                  </m:r>
-                  <m:r>
-                    <m:t>t</m:t>
-                  </m:r>
-                </m:sup>
-              </m:sSubSup>
-            </m:den>
-          </m:f>
-          <m:r>
-            <m:rPr>
-              <m:sty m:val="p"/>
-            </m:rPr>
-            <m:t>,</m:t>
-          </m:r>
-          <m:r>
-            <m:t>  </m:t>
-          </m:r>
-          <m:sSub>
-            <m:e>
-              <m:r>
-                <m:t>θ</m:t>
-              </m:r>
-            </m:e>
-            <m:sub>
-              <m:r>
-                <m:t>t</m:t>
-              </m:r>
-            </m:sub>
-          </m:sSub>
-          <m:r>
-            <m:rPr>
-              <m:sty m:val="p"/>
-            </m:rPr>
-            <m:t>←</m:t>
-          </m:r>
-          <m:sSub>
-            <m:e>
-              <m:r>
-                <m:t>θ</m:t>
-              </m:r>
-            </m:e>
-            <m:sub>
-              <m:r>
-                <m:t>t</m:t>
-              </m:r>
-              <m:r>
-                <m:rPr>
-                  <m:sty m:val="p"/>
-                </m:rPr>
-                <m:t>−</m:t>
-              </m:r>
-              <m:r>
-                <m:t>1</m:t>
-              </m:r>
-            </m:sub>
-          </m:sSub>
-          <m:r>
-            <m:rPr>
-              <m:sty m:val="p"/>
-            </m:rPr>
-            <m:t>−</m:t>
-          </m:r>
-          <m:r>
-            <m:rPr>
-              <m:nor/>
-              <m:sty m:val="p"/>
-            </m:rPr>
-            <m:t>step_size</m:t>
-          </m:r>
-          <m:r>
-            <m:rPr>
-              <m:sty m:val="p"/>
-            </m:rPr>
-            <m:t>⋅</m:t>
-          </m:r>
-          <m:f>
-            <m:fPr>
-              <m:type m:val="bar"/>
-            </m:fPr>
-            <m:num>
-              <m:sSub>
-                <m:e>
-                  <m:r>
-                    <m:t>m</m:t>
-                  </m:r>
-                </m:e>
-                <m:sub>
-                  <m:r>
-                    <m:t>t</m:t>
-                  </m:r>
-                </m:sub>
-              </m:sSub>
-            </m:num>
-            <m:den>
-              <m:rad>
-                <m:radPr>
-                  <m:degHide m:val="on"/>
-                </m:radPr>
-                <m:deg/>
-                <m:e>
-                  <m:sSub>
-                    <m:e>
-                      <m:r>
-                        <m:t>v</m:t>
-                      </m:r>
-                    </m:e>
-                    <m:sub>
-                      <m:r>
-                        <m:t>t</m:t>
-                      </m:r>
-                    </m:sub>
-                  </m:sSub>
-                </m:e>
-              </m:rad>
-              <m:r>
-                <m:rPr>
-                  <m:sty m:val="p"/>
-                </m:rPr>
-                <m:t>+</m:t>
-              </m:r>
-              <m:r>
-                <m:t>ϵ</m:t>
-              </m:r>
-            </m:den>
-          </m:f>
-        </m:oMath>
-      </m:oMathPara>
-    </w:p>
-    <w:p>
-      <w:pPr>
-        <w:pStyle w:val="FirstParagraph"/>
-      </w:pPr>
-      <w:r>
-        <w:t xml:space="preserve">마지막으로, 가중치 감쇠를 그래디언트 갱신과</w:t>
-      </w:r>
-      <w:r>
-        <w:t xml:space="preserve"> </w:t>
-      </w:r>
-      <w:r>
-        <w:rPr>
-          <w:b/>
-          <w:bCs/>
-        </w:rPr>
-        <w:t xml:space="preserve">분리하여</w:t>
-      </w:r>
-      <w:r>
-        <w:t xml:space="preserve"> </w:t>
-      </w:r>
-      <w:r>
-        <w:t xml:space="preserve">적용한다(AdamW의 핵심):</w:t>
-      </w:r>
-    </w:p>
-    <w:p>
-      <w:pPr>
-        <w:pStyle w:val="BodyText"/>
-      </w:pPr>
-      <m:oMathPara>
-        <m:oMathParaPr>
-          <m:jc m:val="center"/>
-        </m:oMathParaPr>
-        <m:oMath>
-          <m:sSub>
-            <m:e>
-              <m:r>
-                <m:t>θ</m:t>
-              </m:r>
-            </m:e>
-            <m:sub>
-              <m:r>
-                <m:t>t</m:t>
-              </m:r>
-            </m:sub>
-          </m:sSub>
-          <m:r>
-            <m:rPr>
-              <m:sty m:val="p"/>
-            </m:rPr>
-            <m:t>←</m:t>
-          </m:r>
-          <m:sSub>
-            <m:e>
-              <m:r>
-                <m:t>θ</m:t>
-              </m:r>
-            </m:e>
-            <m:sub>
-              <m:r>
-                <m:t>t</m:t>
-              </m:r>
-            </m:sub>
-          </m:sSub>
-          <m:r>
-            <m:rPr>
-              <m:sty m:val="p"/>
-            </m:rPr>
-            <m:t>−</m:t>
-          </m:r>
-          <m:r>
-            <m:t>α</m:t>
-          </m:r>
-          <m:r>
-            <m:t> </m:t>
-          </m:r>
-          <m:r>
-            <m:t>λ</m:t>
-          </m:r>
-          <m:r>
-            <m:t> </m:t>
-          </m:r>
-          <m:sSub>
-            <m:e>
-              <m:r>
-                <m:t>θ</m:t>
-              </m:r>
-            </m:e>
-            <m:sub>
-              <m:r>
-                <m:t>t</m:t>
-              </m:r>
-            </m:sub>
-          </m:sSub>
-        </m:oMath>
-      </m:oMathPara>
-    </w:p>
-    <w:p>
-      <w:pPr>
-        <w:pStyle w:val="FirstParagraph"/>
-      </w:pPr>
-      <w:r>
-        <w:t xml:space="preserve">여기서</w:t>
-      </w:r>
-      <w:r>
-        <w:t xml:space="preserve"> </w:t>
-      </w:r>
-      <m:oMath>
-        <m:r>
-          <m:t>λ</m:t>
-        </m:r>
-      </m:oMath>
-      <w:r>
-        <w:t xml:space="preserve">는 weight decay 계수다. 구현은</w:t>
-      </w:r>
-      <w:r>
-        <w:t xml:space="preserve"> </w:t>
-      </w:r>
-      <w:r>
-        <w:rPr>
-          <w:rStyle w:val="VerbatimChar"/>
-        </w:rPr>
-        <w:t xml:space="preserve">optimizer_test.py</w:t>
-      </w:r>
-      <w:r>
-        <w:t xml:space="preserve">의 1,000 스텝 학습 결과를 참조 가중치(</w:t>
-      </w:r>
-      <w:r>
-        <w:rPr>
-          <w:rStyle w:val="VerbatimChar"/>
-        </w:rPr>
-        <w:t xml:space="preserve">optimizer_test.npy</w:t>
-      </w:r>
-      <w:r>
-        <w:t xml:space="preserve">)와 비교하여</w:t>
-      </w:r>
-      <w:r>
-        <w:t xml:space="preserve"> </w:t>
-      </w:r>
-      <w:r>
-        <w:rPr>
-          <w:rStyle w:val="VerbatimChar"/>
-        </w:rPr>
-        <w:t xml:space="preserve">atol=1e-6, rtol=1e-4</w:t>
-      </w:r>
-      <w:r>
-        <w:t xml:space="preserve"> </w:t>
-      </w:r>
-      <w:r>
-        <w:t xml:space="preserve">수준으로 일치함을 확인하였다.</w:t>
-      </w:r>
-    </w:p>
-    <w:bookmarkEnd w:id="19"/>
-    <w:bookmarkStart w:id="20" w:name="감정-분류-헤드와-미세조정-전략"/>
-    <w:p>
-      <w:pPr>
-        <w:pStyle w:val="Heading3"/>
-      </w:pPr>
-      <w:r>
-        <w:t xml:space="preserve">3.5 감정 분류 헤드와 미세조정 전략</w:t>
-      </w:r>
-    </w:p>
-    <w:p>
-      <w:pPr>
-        <w:pStyle w:val="FirstParagraph"/>
-      </w:pPr>
-      <w:r>
-        <w:rPr>
-          <w:rStyle w:val="VerbatimChar"/>
-        </w:rPr>
-        <w:t xml:space="preserve">GPT2SentimentClassifier</w:t>
-      </w:r>
-      <w:r>
-        <w:t xml:space="preserve">는 GPT-2가 출력한 마지막 토큰 표현</w:t>
-      </w:r>
-      <w:r>
-        <w:t xml:space="preserve"> </w:t>
-      </w:r>
-      <m:oMath>
-        <m:r>
-          <m:t>z</m:t>
+          <m:t>/</m:t>
         </m:r>
         <m:r>
           <m:rPr>
             <m:sty m:val="p"/>
           </m:rPr>
-          <m:t>∈</m:t>
+          <m:t>(</m:t>
         </m:r>
-        <m:sSup>
+        <m:rad>
+          <m:radPr>
+            <m:degHide m:val="on"/>
+          </m:radPr>
+          <m:deg/>
           <m:e>
-            <m:r>
-              <m:rPr>
-                <m:scr m:val="double-struck"/>
-                <m:sty m:val="p"/>
-              </m:rPr>
-              <m:t>R</m:t>
-            </m:r>
+            <m:acc>
+              <m:accPr>
+                <m:chr m:val="̂"/>
+              </m:accPr>
+              <m:e>
+                <m:r>
+                  <m:t>v</m:t>
+                </m:r>
+              </m:e>
+            </m:acc>
           </m:e>
-          <m:sup>
-            <m:r>
-              <m:t>H</m:t>
-            </m:r>
-          </m:sup>
-        </m:sSup>
-      </m:oMath>
-      <w:r>
-        <w:t xml:space="preserve">에 dropout과 선형 사영을 적용하여 클래스 로짓을 산출한다:</w:t>
-      </w:r>
-    </w:p>
-    <w:p>
-      <w:pPr>
-        <w:pStyle w:val="BodyText"/>
-      </w:pPr>
-      <m:oMathPara>
-        <m:oMathParaPr>
-          <m:jc m:val="center"/>
-        </m:oMathParaPr>
-        <m:oMath>
-          <m:r>
-            <m:rPr>
-              <m:nor/>
-              <m:sty m:val="p"/>
-            </m:rPr>
-            <m:t>logits</m:t>
-          </m:r>
-          <m:r>
-            <m:rPr>
-              <m:sty m:val="p"/>
-            </m:rPr>
-            <m:t>=</m:t>
-          </m:r>
-          <m:sSub>
-            <m:e>
-              <m:r>
-                <m:t>W</m:t>
-              </m:r>
-            </m:e>
-            <m:sub>
-              <m:r>
-                <m:rPr>
-                  <m:nor/>
-                  <m:sty m:val="p"/>
-                </m:rPr>
-                <m:t>cls</m:t>
-              </m:r>
-            </m:sub>
-          </m:sSub>
-          <m:r>
-            <m:rPr>
-              <m:sty m:val="p"/>
-            </m:rPr>
-            <m:t>⋅</m:t>
-          </m:r>
-          <m:r>
-            <m:rPr>
-              <m:nor/>
-              <m:sty m:val="p"/>
-            </m:rPr>
-            <m:t>Dropout</m:t>
-          </m:r>
-          <m:r>
-            <m:rPr>
-              <m:sty m:val="p"/>
-            </m:rPr>
-            <m:t>(</m:t>
-          </m:r>
-          <m:r>
-            <m:t>z</m:t>
-          </m:r>
-          <m:r>
-            <m:rPr>
-              <m:sty m:val="p"/>
-            </m:rPr>
-            <m:t>)</m:t>
-          </m:r>
-          <m:r>
-            <m:rPr>
-              <m:sty m:val="p"/>
-            </m:rPr>
-            <m:t>+</m:t>
-          </m:r>
-          <m:sSub>
-            <m:e>
-              <m:r>
-                <m:t>b</m:t>
-              </m:r>
-            </m:e>
-            <m:sub>
-              <m:r>
-                <m:rPr>
-                  <m:nor/>
-                  <m:sty m:val="p"/>
-                </m:rPr>
-                <m:t>cls</m:t>
-              </m:r>
-            </m:sub>
-          </m:sSub>
-          <m:r>
-            <m:rPr>
-              <m:sty m:val="p"/>
-            </m:rPr>
-            <m:t>,</m:t>
-          </m:r>
-          <m:r>
-            <m:t>  </m:t>
-          </m:r>
-          <m:sSub>
-            <m:e>
-              <m:r>
-                <m:t>W</m:t>
-              </m:r>
-            </m:e>
-            <m:sub>
-              <m:r>
-                <m:rPr>
-                  <m:nor/>
-                  <m:sty m:val="p"/>
-                </m:rPr>
-                <m:t>cls</m:t>
-              </m:r>
-            </m:sub>
-          </m:sSub>
-          <m:r>
-            <m:rPr>
-              <m:sty m:val="p"/>
-            </m:rPr>
-            <m:t>∈</m:t>
-          </m:r>
-          <m:sSup>
-            <m:e>
-              <m:r>
-                <m:rPr>
-                  <m:scr m:val="double-struck"/>
-                  <m:sty m:val="p"/>
-                </m:rPr>
-                <m:t>R</m:t>
-              </m:r>
-            </m:e>
-            <m:sup>
-              <m:r>
-                <m:t>C</m:t>
-              </m:r>
-              <m:r>
-                <m:rPr>
-                  <m:sty m:val="p"/>
-                </m:rPr>
-                <m:t>×</m:t>
-              </m:r>
-              <m:r>
-                <m:t>H</m:t>
-              </m:r>
-            </m:sup>
-          </m:sSup>
-        </m:oMath>
-      </m:oMathPara>
-    </w:p>
-    <w:p>
-      <w:pPr>
-        <w:pStyle w:val="FirstParagraph"/>
-      </w:pPr>
-      <w:r>
-        <w:t xml:space="preserve">SST는</w:t>
-      </w:r>
-      <w:r>
-        <w:t xml:space="preserve"> </w:t>
-      </w:r>
-      <m:oMath>
+        </m:rad>
         <m:r>
-          <m:t>C</m:t>
+          <m:rPr>
+            <m:sty m:val="p"/>
+          </m:rPr>
+          <m:t>+</m:t>
+        </m:r>
+        <m:r>
+          <m:t>ϵ</m:t>
         </m:r>
         <m:r>
           <m:rPr>
             <m:sty m:val="p"/>
           </m:rPr>
-          <m:t>=</m:t>
-        </m:r>
-        <m:r>
-          <m:t>5</m:t>
+          <m:t>)</m:t>
         </m:r>
       </m:oMath>
       <w:r>
-        <w:t xml:space="preserve">, CFIMDB는</w:t>
+        <w:t xml:space="preserve"> </w:t>
+      </w:r>
+      <w:r>
+        <w:t xml:space="preserve">이후 정규화 항</w:t>
       </w:r>
       <w:r>
         <w:t xml:space="preserve"> </w:t>
       </w:r>
       <m:oMath>
         <m:r>
-          <m:t>C</m:t>
+          <m:t>θ</m:t>
         </m:r>
         <m:r>
           <m:rPr>
             <m:sty m:val="p"/>
           </m:rPr>
-          <m:t>=</m:t>
+          <m:t>←</m:t>
         </m:r>
         <m:r>
-          <m:t>2</m:t>
+          <m:t>θ</m:t>
+        </m:r>
+        <m:r>
+          <m:rPr>
+            <m:sty m:val="p"/>
+          </m:rPr>
+          <m:t>−</m:t>
+        </m:r>
+        <m:r>
+          <m:t>α</m:t>
+        </m:r>
+        <m:r>
+          <m:t>λ</m:t>
+        </m:r>
+        <m:r>
+          <m:t>θ</m:t>
         </m:r>
       </m:oMath>
       <w:r>
-        <w:t xml:space="preserve">이다. 학습은 두 가지 전략으로 수행한다:</w:t>
+        <w:t xml:space="preserve">를 별도로 적용하는 것이 AdamW의 핵심이다.</w:t>
+      </w:r>
+    </w:p>
+    <w:bookmarkEnd w:id="17"/>
+    <w:bookmarkStart w:id="18" w:name="감정-분류-헤드와-미세조정-전략"/>
+    <w:p>
+      <w:pPr>
+        <w:pStyle w:val="Heading3"/>
+      </w:pPr>
+      <w:r>
+        <w:t xml:space="preserve">3.3 감정 분류 헤드와 미세조정 전략</w:t>
+      </w:r>
+    </w:p>
+    <w:p>
+      <w:pPr>
+        <w:pStyle w:val="FirstParagraph"/>
+      </w:pPr>
+      <w:r>
+        <w:rPr>
+          <w:rStyle w:val="VerbatimChar"/>
+        </w:rPr>
+        <w:t xml:space="preserve">GPT2SentimentClassifier</w:t>
+      </w:r>
+      <w:r>
+        <w:t xml:space="preserve">는 마지막 토큰 표현에 dropout과 선형 사영을 적용해 클래스 로짓을 산출한다(클래스 수</w:t>
+      </w:r>
+      <w:r>
+        <w:t xml:space="preserve"> </w:t>
+      </w:r>
+      <m:oMath>
+        <m:r>
+          <m:t>C</m:t>
+        </m:r>
+      </m:oMath>
+      <w:r>
+        <w:t xml:space="preserve">: SST 5, CFIMDB 2). 학습은 두 전략을</w:t>
+      </w:r>
+      <w:r>
+        <w:t xml:space="preserve"> </w:t>
+      </w:r>
+      <w:r>
+        <w:rPr>
+          <w:b/>
+          <w:bCs/>
+        </w:rPr>
+        <w:t xml:space="preserve">통제 비교</w:t>
+      </w:r>
+      <w:r>
+        <w:t xml:space="preserve">한다:</w:t>
       </w:r>
     </w:p>
     <w:p>
@@ -2722,7 +1379,7 @@
         <w:t xml:space="preserve"> </w:t>
       </w:r>
       <w:r>
-        <w:t xml:space="preserve">GPT-2 파라미터를 동결(</w:t>
+        <w:t xml:space="preserve">GPT-2를 동결(</w:t>
       </w:r>
       <w:r>
         <w:rPr>
@@ -2731,7 +1388,7 @@
         <w:t xml:space="preserve">requires_grad=False</w:t>
       </w:r>
       <w:r>
-        <w:t xml:space="preserve">)하고 분류 헤드만 학습한다. 사전학습된 표현의 전이 가능성을 평가한다.</w:t>
+        <w:t xml:space="preserve">)하고 분류 헤드만 학습 → 사전학습 표현의 전이 가능성 평가.</w:t>
       </w:r>
     </w:p>
     <w:p>
@@ -2753,17 +1410,77 @@
         <w:t xml:space="preserve"> </w:t>
       </w:r>
       <w:r>
-        <w:t xml:space="preserve">GPT-2 전체 파라미터를 함께 갱신한다. 태스크에 맞춰 표현 자체를 적응시킨다.</w:t>
-      </w:r>
-    </w:p>
-    <w:bookmarkEnd w:id="20"/>
-    <w:bookmarkStart w:id="21" w:name="기준-모델-baseline"/>
+        <w:t xml:space="preserve">GPT-2 전체를 갱신 → 표현 자체를 태스크에 적응.</w:t>
+      </w:r>
+    </w:p>
+    <w:bookmarkEnd w:id="18"/>
+    <w:bookmarkStart w:id="19" w:name="구현-검증"/>
     <w:p>
       <w:pPr>
         <w:pStyle w:val="Heading3"/>
       </w:pPr>
       <w:r>
-        <w:t xml:space="preserve">3.6 기준 모델 (Baseline)</w:t>
+        <w:t xml:space="preserve">3.4 구현 검증</w:t>
+      </w:r>
+    </w:p>
+    <w:p>
+      <w:pPr>
+        <w:pStyle w:val="FirstParagraph"/>
+      </w:pPr>
+      <w:r>
+        <w:t xml:space="preserve">두 구현은 객관적 기준으로 정합성을 확인하였다: GPT-2는 HuggingFace 공식 모델과 마지막 은닉 상태가</w:t>
+      </w:r>
+      <w:r>
+        <w:t xml:space="preserve"> </w:t>
+      </w:r>
+      <w:r>
+        <w:rPr>
+          <w:rStyle w:val="VerbatimChar"/>
+        </w:rPr>
+        <w:t xml:space="preserve">atol=0.1</w:t>
+      </w:r>
+      <w:r>
+        <w:t xml:space="preserve">에서 일치하고(</w:t>
+      </w:r>
+      <w:r>
+        <w:rPr>
+          <w:rStyle w:val="VerbatimChar"/>
+        </w:rPr>
+        <w:t xml:space="preserve">sanity_check.py</w:t>
+      </w:r>
+      <w:r>
+        <w:t xml:space="preserve">), AdamW는 1,000 스텝 학습 후 가중치가 참조값과</w:t>
+      </w:r>
+      <w:r>
+        <w:t xml:space="preserve"> </w:t>
+      </w:r>
+      <w:r>
+        <w:rPr>
+          <w:rStyle w:val="VerbatimChar"/>
+        </w:rPr>
+        <w:t xml:space="preserve">atol=1e-6</w:t>
+      </w:r>
+      <w:r>
+        <w:t xml:space="preserve">에서 일치한다(</w:t>
+      </w:r>
+      <w:r>
+        <w:rPr>
+          <w:rStyle w:val="VerbatimChar"/>
+        </w:rPr>
+        <w:t xml:space="preserve">optimizer_test.py</w:t>
+      </w:r>
+      <w:r>
+        <w:t xml:space="preserve">).</w:t>
+      </w:r>
+    </w:p>
+    <w:bookmarkEnd w:id="19"/>
+    <w:bookmarkStart w:id="20" w:name="기준-모델-baseline"/>
+    <w:p>
+      <w:pPr>
+        <w:pStyle w:val="Heading3"/>
+      </w:pPr>
+      <w:r>
+        <w:t xml:space="preserve">3.5 기준 모델 (Baseline)</w:t>
       </w:r>
     </w:p>
     <w:p>
@@ -2901,9 +1618,9 @@
         </w:pict>
       </w:r>
     </w:p>
+    <w:bookmarkEnd w:id="20"/>
     <w:bookmarkEnd w:id="21"/>
-    <w:bookmarkEnd w:id="22"/>
-    <w:bookmarkStart w:id="27" w:name="실험-experiments"/>
+    <w:bookmarkStart w:id="26" w:name="실험-experiments"/>
     <w:p>
       <w:pPr>
         <w:pStyle w:val="Heading2"/>
@@ -2912,7 +1629,7 @@
         <w:t xml:space="preserve">4. 실험 (Experiments)</w:t>
       </w:r>
     </w:p>
-    <w:bookmarkStart w:id="23" w:name="데이터-data"/>
+    <w:bookmarkStart w:id="22" w:name="데이터-data"/>
     <w:p>
       <w:pPr>
         <w:pStyle w:val="Heading3"/>
@@ -3215,8 +1932,8 @@
         <w:t xml:space="preserve">형식으로 포함되어 있으며, 모델 학습·튜닝·평가에는 제공된 train/dev split만 사용하였다. test split은 최종 예측 산출에만 사용하고, 모델 개선에 활용하지 않았다(연구 윤리 준수).</w:t>
       </w:r>
     </w:p>
-    <w:bookmarkEnd w:id="23"/>
-    <w:bookmarkStart w:id="24" w:name="평가-방법-evaluation"/>
+    <w:bookmarkEnd w:id="22"/>
+    <w:bookmarkStart w:id="23" w:name="평가-방법-evaluation"/>
     <w:p>
       <w:pPr>
         <w:pStyle w:val="Heading3"/>
@@ -3272,8 +1989,8 @@
         <w:t xml:space="preserve">을 보조 지표로 보고한다. 정량 비교는 라벨이 공개된 dev split에서 수행하였다.</w:t>
       </w:r>
     </w:p>
-    <w:bookmarkEnd w:id="24"/>
-    <w:bookmarkStart w:id="25" w:name="실험-세부-정보-experimental-details"/>
+    <w:bookmarkEnd w:id="23"/>
+    <w:bookmarkStart w:id="24" w:name="실험-세부-정보-experimental-details"/>
     <w:p>
       <w:pPr>
         <w:pStyle w:val="Heading3"/>
@@ -3621,8 +2338,8 @@
         <w:t xml:space="preserve">에 포함된 패키지만 사용하였다.</w:t>
       </w:r>
     </w:p>
-    <w:bookmarkEnd w:id="25"/>
-    <w:bookmarkStart w:id="26" w:name="결과-results"/>
+    <w:bookmarkEnd w:id="24"/>
+    <w:bookmarkStart w:id="25" w:name="결과-results"/>
     <w:p>
       <w:pPr>
         <w:pStyle w:val="Heading3"/>
@@ -4562,6 +3279,191 @@
           <w:b/>
           <w:bCs/>
         </w:rPr>
+        <w:t xml:space="preserve">SST 클래스별 F1 (full-model).</w:t>
+      </w:r>
+      <w:r>
+        <w:t xml:space="preserve"> </w:t>
+      </w:r>
+      <w:r>
+        <w:t xml:space="preserve">등급별 난이도 차이를 정량적으로 보여준다.</w:t>
+      </w:r>
+    </w:p>
+    <w:tbl>
+      <w:tblPr>
+        <w:tblStyle w:val="Table"/>
+        <w:tblW w:type="pct" w:w="5000"/>
+        <w:tblLayout w:type="fixed"/>
+        <w:tblLook w:firstRow="1" w:lastRow="0" w:firstColumn="0" w:lastColumn="0" w:noHBand="0" w:noVBand="0" w:val="0020"/>
+      </w:tblPr>
+      <w:tblGrid>
+        <w:gridCol w:w="1320"/>
+        <w:gridCol w:w="1320"/>
+        <w:gridCol w:w="1320"/>
+        <w:gridCol w:w="1320"/>
+        <w:gridCol w:w="1320"/>
+        <w:gridCol w:w="1320"/>
+      </w:tblGrid>
+      <w:tr>
+        <w:trPr>
+          <w:tblHeader w:val="on"/>
+        </w:trPr>
+        <w:tc>
+          <w:tcPr/>
+          <w:p>
+            <w:pPr>
+              <w:pStyle w:val="Compact"/>
+            </w:pPr>
+            <w:r>
+              <w:t xml:space="preserve">클래스</w:t>
+            </w:r>
+          </w:p>
+        </w:tc>
+        <w:tc>
+          <w:tcPr/>
+          <w:p>
+            <w:pPr>
+              <w:pStyle w:val="Compact"/>
+            </w:pPr>
+            <w:r>
+              <w:t xml:space="preserve">0 (very neg)</w:t>
+            </w:r>
+          </w:p>
+        </w:tc>
+        <w:tc>
+          <w:tcPr/>
+          <w:p>
+            <w:pPr>
+              <w:pStyle w:val="Compact"/>
+            </w:pPr>
+            <w:r>
+              <w:t xml:space="preserve">1 (neg)</w:t>
+            </w:r>
+          </w:p>
+        </w:tc>
+        <w:tc>
+          <w:tcPr/>
+          <w:p>
+            <w:pPr>
+              <w:pStyle w:val="Compact"/>
+            </w:pPr>
+            <w:r>
+              <w:t xml:space="preserve">2 (neutral)</w:t>
+            </w:r>
+          </w:p>
+        </w:tc>
+        <w:tc>
+          <w:tcPr/>
+          <w:p>
+            <w:pPr>
+              <w:pStyle w:val="Compact"/>
+            </w:pPr>
+            <w:r>
+              <w:t xml:space="preserve">3 (pos)</w:t>
+            </w:r>
+          </w:p>
+        </w:tc>
+        <w:tc>
+          <w:tcPr/>
+          <w:p>
+            <w:pPr>
+              <w:pStyle w:val="Compact"/>
+            </w:pPr>
+            <w:r>
+              <w:t xml:space="preserve">4 (very pos)</w:t>
+            </w:r>
+          </w:p>
+        </w:tc>
+      </w:tr>
+      <w:tr>
+        <w:tc>
+          <w:tcPr/>
+          <w:p>
+            <w:pPr>
+              <w:pStyle w:val="Compact"/>
+            </w:pPr>
+            <w:r>
+              <w:t xml:space="preserve">F1</w:t>
+            </w:r>
+          </w:p>
+        </w:tc>
+        <w:tc>
+          <w:tcPr/>
+          <w:p>
+            <w:pPr>
+              <w:pStyle w:val="Compact"/>
+            </w:pPr>
+            <w:r>
+              <w:t xml:space="preserve">0.362</w:t>
+            </w:r>
+          </w:p>
+        </w:tc>
+        <w:tc>
+          <w:tcPr/>
+          <w:p>
+            <w:pPr>
+              <w:pStyle w:val="Compact"/>
+            </w:pPr>
+            <w:r>
+              <w:t xml:space="preserve">0.601</w:t>
+            </w:r>
+          </w:p>
+        </w:tc>
+        <w:tc>
+          <w:tcPr/>
+          <w:p>
+            <w:pPr>
+              <w:pStyle w:val="Compact"/>
+            </w:pPr>
+            <w:r>
+              <w:rPr>
+                <w:b/>
+                <w:bCs/>
+              </w:rPr>
+              <w:t xml:space="preserve">0.342</w:t>
+            </w:r>
+          </w:p>
+        </w:tc>
+        <w:tc>
+          <w:tcPr/>
+          <w:p>
+            <w:pPr>
+              <w:pStyle w:val="Compact"/>
+            </w:pPr>
+            <w:r>
+              <w:t xml:space="preserve">0.585</w:t>
+            </w:r>
+          </w:p>
+        </w:tc>
+        <w:tc>
+          <w:tcPr/>
+          <w:p>
+            <w:pPr>
+              <w:pStyle w:val="Compact"/>
+            </w:pPr>
+            <w:r>
+              <w:t xml:space="preserve">0.498</w:t>
+            </w:r>
+          </w:p>
+        </w:tc>
+      </w:tr>
+    </w:tbl>
+    <w:p>
+      <w:pPr>
+        <w:pStyle w:val="BodyText"/>
+      </w:pPr>
+      <w:r>
+        <w:t xml:space="preserve">중앙(neutral)과 양 극단(very neg/pos)의 F1이 낮고, 다수 클래스인 neg/pos가 높다 — 경계가 모호한 등급일수록 어렵다는 직관과 일치한다.</w:t>
+      </w:r>
+    </w:p>
+    <w:p>
+      <w:pPr>
+        <w:pStyle w:val="BodyText"/>
+      </w:pPr>
+      <w:r>
+        <w:rPr>
+          <w:b/>
+          <w:bCs/>
+        </w:rPr>
         <w:t xml:space="preserve">결과에 대한 논의.</w:t>
       </w:r>
     </w:p>
@@ -4706,9 +3608,9 @@
         </w:pict>
       </w:r>
     </w:p>
+    <w:bookmarkEnd w:id="25"/>
     <w:bookmarkEnd w:id="26"/>
-    <w:bookmarkEnd w:id="27"/>
-    <w:bookmarkStart w:id="28" w:name="결론-및-향후-연구-conclusion-future-work"/>
+    <w:bookmarkStart w:id="27" w:name="결론-및-향후-연구-conclusion-future-work"/>
     <w:p>
       <w:pPr>
         <w:pStyle w:val="Heading2"/>
@@ -4785,8 +3687,8 @@
         </w:pict>
       </w:r>
     </w:p>
-    <w:bookmarkEnd w:id="28"/>
-    <w:bookmarkStart w:id="29" w:name="참고-문헌-references"/>
+    <w:bookmarkEnd w:id="27"/>
+    <w:bookmarkStart w:id="28" w:name="참고-문헌-references"/>
     <w:p>
       <w:pPr>
         <w:pStyle w:val="Heading2"/>
@@ -4915,8 +3817,8 @@
         <w:t xml:space="preserve">In Advances in Neural Information Processing Systems (NeurIPS), 2017.</w:t>
       </w:r>
     </w:p>
+    <w:bookmarkEnd w:id="28"/>
     <w:bookmarkEnd w:id="29"/>
-    <w:bookmarkEnd w:id="30"/>
     <w:sectPr>
       <w:footnotePr>
         <w:numRestart w:val="eachSect"/>

</xml_diff>